<commit_message>
docs: clarify operational capability hierarchy
</commit_message>
<xml_diff>
--- a/docs/DOC-000 — Índice Maestro de Arquitectura y Gobierno Documental.docx
+++ b/docs/DOC-000 — Índice Maestro de Arquitectura y Gobierno Documental.docx
@@ -1,8 +1,8 @@
 
 <file path=word/document.xml><?xml version="1.0" encoding="utf-8"?>
-<w:document xmlns:mc="http://schemas.openxmlformats.org/markup-compatibility/2006" xmlns:o="urn:schemas-microsoft-com:office:office" xmlns:r="http://schemas.openxmlformats.org/officeDocument/2006/relationships" xmlns:m="http://schemas.openxmlformats.org/officeDocument/2006/math" xmlns:v="urn:schemas-microsoft-com:vml" xmlns:wp="http://schemas.openxmlformats.org/drawingml/2006/wordprocessingDrawing" xmlns:w10="urn:schemas-microsoft-com:office:word" xmlns:w="http://schemas.openxmlformats.org/wordprocessingml/2006/main" xmlns:wne="http://schemas.microsoft.com/office/word/2006/wordml" xmlns:sl="http://schemas.openxmlformats.org/schemaLibrary/2006/main" xmlns:a="http://schemas.openxmlformats.org/drawingml/2006/main" xmlns:pic="http://schemas.openxmlformats.org/drawingml/2006/picture" xmlns:c="http://schemas.openxmlformats.org/drawingml/2006/chart" xmlns:lc="http://schemas.openxmlformats.org/drawingml/2006/lockedCanvas" xmlns:dgm="http://schemas.openxmlformats.org/drawingml/2006/diagram" xmlns:wps="http://schemas.microsoft.com/office/word/2010/wordprocessingShape" xmlns:wpg="http://schemas.microsoft.com/office/word/2010/wordprocessingGroup" xmlns:w14="http://schemas.microsoft.com/office/word/2010/wordml" xmlns:w15="http://schemas.microsoft.com/office/word/2012/wordml" xmlns:w16="http://schemas.microsoft.com/office/word/2018/wordml" xmlns:w16cex="http://schemas.microsoft.com/office/word/2018/wordml/cex" xmlns:w16cid="http://schemas.microsoft.com/office/word/2016/wordml/cid" xmlns="http://schemas.microsoft.com/office/tasks/2019/documenttasks" xmlns:cr="http://schemas.microsoft.com/office/comments/2020/reactions">
+<w:document xmlns:ns1="http://schemas.microsoft.com/office/word/2010/wordml" xmlns:ns2="urn:schemas-microsoft-com:vml" xmlns:ns3="urn:schemas-microsoft-com:office:office" xmlns:w="http://schemas.openxmlformats.org/wordprocessingml/2006/main">
   <w:body>
-    <w:p>
+    <w:p ns1:paraId="00000001">
       <w:pPr>
         <w:pStyle w:val="Heading1"/>
         <w:keepNext w:val="0"/>
@@ -28,7 +28,7 @@
         <w:t xml:space="preserve">DOC-000 — Índice Maestro de Arquitectura y Gobierno Documental</w:t>
       </w:r>
     </w:p>
-    <w:p>
+    <w:p ns1:paraId="00000002">
       <w:pPr>
         <w:pStyle w:val="Heading2"/>
         <w:keepNext w:val="0"/>
@@ -54,13 +54,13 @@
         <w:t xml:space="preserve">TramitaGO Quant Platform</w:t>
       </w:r>
     </w:p>
-    <w:p>
+    <w:p ns1:paraId="00000003">
       <w:pPr>
         <w:rPr/>
       </w:pPr>
       <w:r>
         <w:pict>
-          <v:rect style="width:0.0pt;height:1.5pt" o:hr="t" o:hrstd="t" o:hralign="center" fillcolor="#A0A0A0" stroked="f"/>
+          <ns2:rect style="width:0.0pt;height:1.5pt" ns3:hr="t" ns3:hrstd="t" ns3:hralign="center" fillcolor="#A0A0A0" stroked="f"/>
         </w:pict>
       </w:r>
       <w:r>
@@ -69,7 +69,7 @@
         </w:rPr>
       </w:r>
     </w:p>
-    <w:p>
+    <w:p ns1:paraId="00000004">
       <w:pPr>
         <w:pStyle w:val="Heading2"/>
         <w:keepNext w:val="0"/>
@@ -95,7 +95,7 @@
         <w:t xml:space="preserve">1. Identificación del documento</w:t>
       </w:r>
     </w:p>
-    <w:p>
+    <w:p ns1:paraId="00000005">
       <w:pPr>
         <w:numPr>
           <w:ilvl w:val="0"/>
@@ -119,7 +119,7 @@
         <w:t xml:space="preserve"> DOC-000</w:t>
       </w:r>
     </w:p>
-    <w:p>
+    <w:p ns1:paraId="00000006">
       <w:pPr>
         <w:numPr>
           <w:ilvl w:val="0"/>
@@ -143,7 +143,7 @@
         <w:t xml:space="preserve"> Índice Maestro de Arquitectura y Gobierno Documental</w:t>
       </w:r>
     </w:p>
-    <w:p>
+    <w:p ns1:paraId="00000007">
       <w:pPr>
         <w:numPr>
           <w:ilvl w:val="0"/>
@@ -167,7 +167,7 @@
         <w:t xml:space="preserve"> 1.0</w:t>
       </w:r>
     </w:p>
-    <w:p>
+    <w:p ns1:paraId="00000008">
       <w:pPr>
         <w:numPr>
           <w:ilvl w:val="0"/>
@@ -191,7 +191,7 @@
         <w:t xml:space="preserve"> Approved (Baseline 1.0 candidate)</w:t>
       </w:r>
     </w:p>
-    <w:p>
+    <w:p ns1:paraId="00000009">
       <w:pPr>
         <w:numPr>
           <w:ilvl w:val="0"/>
@@ -215,7 +215,7 @@
         <w:t xml:space="preserve"> Documento de Gobierno del Sistema</w:t>
       </w:r>
     </w:p>
-    <w:p>
+    <w:p ns1:paraId="0000000A">
       <w:pPr>
         <w:numPr>
           <w:ilvl w:val="0"/>
@@ -239,13 +239,13 @@
         <w:t xml:space="preserve"> Todos los DOC y ADR existentes</w:t>
       </w:r>
     </w:p>
-    <w:p>
+    <w:p ns1:paraId="0000000B">
       <w:pPr>
         <w:rPr/>
       </w:pPr>
       <w:r>
         <w:pict>
-          <v:rect style="width:0.0pt;height:1.5pt" o:hr="t" o:hrstd="t" o:hralign="center" fillcolor="#A0A0A0" stroked="f"/>
+          <ns2:rect style="width:0.0pt;height:1.5pt" ns3:hr="t" ns3:hrstd="t" ns3:hralign="center" fillcolor="#A0A0A0" stroked="f"/>
         </w:pict>
       </w:r>
       <w:r>
@@ -254,7 +254,7 @@
         </w:rPr>
       </w:r>
     </w:p>
-    <w:p>
+    <w:p ns1:paraId="0000000C">
       <w:pPr>
         <w:pStyle w:val="Heading1"/>
         <w:keepNext w:val="0"/>
@@ -280,7 +280,7 @@
         <w:t xml:space="preserve">2. Propósito</w:t>
       </w:r>
     </w:p>
-    <w:p>
+    <w:p ns1:paraId="0000000D">
       <w:pPr>
         <w:spacing w:after="240" w:before="240" w:lineRule="auto"/>
         <w:rPr/>
@@ -306,7 +306,7 @@
         <w:t xml:space="preserve">.</w:t>
       </w:r>
     </w:p>
-    <w:p>
+    <w:p ns1:paraId="0000000E">
       <w:pPr>
         <w:spacing w:after="240" w:before="240" w:lineRule="auto"/>
         <w:rPr/>
@@ -318,7 +318,7 @@
         <w:t xml:space="preserve">Su función no es técnica.</w:t>
       </w:r>
     </w:p>
-    <w:p>
+    <w:p ns1:paraId="0000000F">
       <w:pPr>
         <w:spacing w:after="240" w:before="240" w:lineRule="auto"/>
         <w:rPr/>
@@ -330,7 +330,7 @@
         <w:t xml:space="preserve">Su función es:</w:t>
       </w:r>
     </w:p>
-    <w:p>
+    <w:p ns1:paraId="00000010">
       <w:pPr>
         <w:spacing w:after="240" w:before="240" w:lineRule="auto"/>
         <w:ind w:left="600" w:right="600" w:firstLine="0"/>
@@ -348,13 +348,13 @@
         <w:t xml:space="preserve">Convertir un conjunto de documentos en un sistema documental gobernado, reproducible y auditable.</w:t>
       </w:r>
     </w:p>
-    <w:p>
+    <w:p ns1:paraId="00000011">
       <w:pPr>
         <w:rPr/>
       </w:pPr>
       <w:r>
         <w:pict>
-          <v:rect style="width:0.0pt;height:1.5pt" o:hr="t" o:hrstd="t" o:hralign="center" fillcolor="#A0A0A0" stroked="f"/>
+          <ns2:rect style="width:0.0pt;height:1.5pt" ns3:hr="t" ns3:hrstd="t" ns3:hralign="center" fillcolor="#A0A0A0" stroked="f"/>
         </w:pict>
       </w:r>
       <w:r>
@@ -363,7 +363,7 @@
         </w:rPr>
       </w:r>
     </w:p>
-    <w:p>
+    <w:p ns1:paraId="00000012">
       <w:pPr>
         <w:pStyle w:val="Heading1"/>
         <w:keepNext w:val="0"/>
@@ -389,7 +389,7 @@
         <w:t xml:space="preserve">3. Estado del sistema</w:t>
       </w:r>
     </w:p>
-    <w:p>
+    <w:p ns1:paraId="00000013">
       <w:pPr>
         <w:spacing w:after="240" w:before="240" w:lineRule="auto"/>
         <w:rPr/>
@@ -401,7 +401,7 @@
         <w:t xml:space="preserve">El proyecto se encuentra en:</w:t>
       </w:r>
     </w:p>
-    <w:p>
+    <w:p ns1:paraId="00000014">
       <w:pPr>
         <w:spacing w:after="240" w:before="240" w:lineRule="auto"/>
         <w:ind w:left="600" w:right="600" w:firstLine="0"/>
@@ -419,7 +419,7 @@
         <w:t xml:space="preserve">Fase de transición entre diseño arquitectónico y construcción del MVP</w:t>
       </w:r>
     </w:p>
-    <w:p>
+    <w:p ns1:paraId="00000015">
       <w:pPr>
         <w:spacing w:after="240" w:before="240" w:lineRule="auto"/>
         <w:rPr/>
@@ -431,7 +431,7 @@
         <w:t xml:space="preserve">Esto implica:</w:t>
       </w:r>
     </w:p>
-    <w:p>
+    <w:p ns1:paraId="00000016">
       <w:pPr>
         <w:numPr>
           <w:ilvl w:val="0"/>
@@ -447,7 +447,7 @@
         <w:t xml:space="preserve">La arquitectura está definida en alto nivel.</w:t>
       </w:r>
     </w:p>
-    <w:p>
+    <w:p ns1:paraId="00000017">
       <w:pPr>
         <w:numPr>
           <w:ilvl w:val="0"/>
@@ -463,7 +463,7 @@
         <w:t xml:space="preserve">Los primeros módulos técnicos han sido diseñados.</w:t>
       </w:r>
     </w:p>
-    <w:p>
+    <w:p ns1:paraId="00000018">
       <w:pPr>
         <w:numPr>
           <w:ilvl w:val="0"/>
@@ -479,13 +479,13 @@
         <w:t xml:space="preserve">Aún no existe producción ni ejecución real de trading.</w:t>
       </w:r>
     </w:p>
-    <w:p>
+    <w:p ns1:paraId="00000019">
       <w:pPr>
         <w:rPr/>
       </w:pPr>
       <w:r>
         <w:pict>
-          <v:rect style="width:0.0pt;height:1.5pt" o:hr="t" o:hrstd="t" o:hralign="center" fillcolor="#A0A0A0" stroked="f"/>
+          <ns2:rect style="width:0.0pt;height:1.5pt" ns3:hr="t" ns3:hrstd="t" ns3:hralign="center" fillcolor="#A0A0A0" stroked="f"/>
         </w:pict>
       </w:r>
       <w:r>
@@ -494,7 +494,7 @@
         </w:rPr>
       </w:r>
     </w:p>
-    <w:p>
+    <w:p ns1:paraId="0000001A">
       <w:pPr>
         <w:pStyle w:val="Heading1"/>
         <w:keepNext w:val="0"/>
@@ -520,7 +520,7 @@
         <w:t xml:space="preserve">4. Baseline vigente</w:t>
       </w:r>
     </w:p>
-    <w:p>
+    <w:p ns1:paraId="0000001B">
       <w:pPr>
         <w:pStyle w:val="Heading2"/>
         <w:keepNext w:val="0"/>
@@ -546,7 +546,7 @@
         <w:t xml:space="preserve">Baseline 0.x (Pre-implementación controlada)</w:t>
       </w:r>
     </w:p>
-    <w:p>
+    <w:p ns1:paraId="0000001C">
       <w:pPr>
         <w:spacing w:after="240" w:before="240" w:lineRule="auto"/>
         <w:rPr/>
@@ -558,7 +558,7 @@
         <w:t xml:space="preserve">Incluye:</w:t>
       </w:r>
     </w:p>
-    <w:p>
+    <w:p ns1:paraId="0000001D">
       <w:pPr>
         <w:numPr>
           <w:ilvl w:val="0"/>
@@ -574,7 +574,7 @@
         <w:t xml:space="preserve">DOC-001 a DOC-015 (reestructurados)</w:t>
       </w:r>
     </w:p>
-    <w:p>
+    <w:p ns1:paraId="0000001E">
       <w:pPr>
         <w:numPr>
           <w:ilvl w:val="0"/>
@@ -590,7 +590,7 @@
         <w:t xml:space="preserve">ADR-001 a ADR-006</w:t>
       </w:r>
     </w:p>
-    <w:p>
+    <w:p ns1:paraId="0000001F">
       <w:pPr>
         <w:spacing w:after="240" w:before="240" w:lineRule="auto"/>
         <w:rPr/>
@@ -602,7 +602,7 @@
         <w:t xml:space="preserve">Características:</w:t>
       </w:r>
     </w:p>
-    <w:p>
+    <w:p ns1:paraId="00000020">
       <w:pPr>
         <w:numPr>
           <w:ilvl w:val="0"/>
@@ -618,7 +618,7 @@
         <w:t xml:space="preserve">arquitectura conceptual estabilizada</w:t>
       </w:r>
     </w:p>
-    <w:p>
+    <w:p ns1:paraId="00000021">
       <w:pPr>
         <w:numPr>
           <w:ilvl w:val="0"/>
@@ -634,7 +634,7 @@
         <w:t xml:space="preserve">decisiones técnicas iniciales definidas</w:t>
       </w:r>
     </w:p>
-    <w:p>
+    <w:p ns1:paraId="00000022">
       <w:pPr>
         <w:numPr>
           <w:ilvl w:val="0"/>
@@ -650,13 +650,13 @@
         <w:t xml:space="preserve">inicio de implementación MVP en curso</w:t>
       </w:r>
     </w:p>
-    <w:p>
+    <w:p ns1:paraId="00000023">
       <w:pPr>
         <w:rPr/>
       </w:pPr>
       <w:r>
         <w:pict>
-          <v:rect style="width:0.0pt;height:1.5pt" o:hr="t" o:hrstd="t" o:hralign="center" fillcolor="#A0A0A0" stroked="f"/>
+          <ns2:rect style="width:0.0pt;height:1.5pt" ns3:hr="t" ns3:hrstd="t" ns3:hralign="center" fillcolor="#A0A0A0" stroked="f"/>
         </w:pict>
       </w:r>
       <w:r>
@@ -665,7 +665,7 @@
         </w:rPr>
       </w:r>
     </w:p>
-    <w:p>
+    <w:p ns1:paraId="00000024">
       <w:pPr>
         <w:pStyle w:val="Heading1"/>
         <w:keepNext w:val="0"/>
@@ -691,7 +691,7 @@
         <w:t xml:space="preserve">5. Estructura oficial del sistema documental</w:t>
       </w:r>
     </w:p>
-    <w:p>
+    <w:p ns1:paraId="00000025">
       <w:pPr>
         <w:pStyle w:val="Heading2"/>
         <w:keepNext w:val="0"/>
@@ -717,7 +717,7 @@
         <w:t xml:space="preserve">5.1 Tipos de artefactos</w:t>
       </w:r>
     </w:p>
-    <w:p>
+    <w:p ns1:paraId="00000026">
       <w:pPr>
         <w:spacing w:after="240" w:before="240" w:lineRule="auto"/>
         <w:ind w:left="720" w:firstLine="0"/>
@@ -729,7 +729,7 @@
         </w:rPr>
       </w:r>
     </w:p>
-    <w:p>
+    <w:p ns1:paraId="00000027">
       <w:pPr>
         <w:spacing w:after="240" w:before="240" w:lineRule="auto"/>
         <w:ind w:left="0" w:firstLine="0"/>
@@ -742,7 +742,7 @@
         <w:t xml:space="preserve">El sistema está compuesto por:</w:t>
       </w:r>
     </w:p>
-    <w:p>
+    <w:p ns1:paraId="00000028">
       <w:pPr>
         <w:numPr>
           <w:ilvl w:val="0"/>
@@ -758,7 +758,7 @@
         <w:t xml:space="preserve">DOC: documentos de gobierno, arquitectura y diseño;</w:t>
       </w:r>
     </w:p>
-    <w:p>
+    <w:p ns1:paraId="00000029">
       <w:pPr>
         <w:numPr>
           <w:ilvl w:val="0"/>
@@ -774,7 +774,7 @@
         <w:t xml:space="preserve">ADR: decisiones arquitectónicas formales;</w:t>
       </w:r>
     </w:p>
-    <w:p>
+    <w:p ns1:paraId="0000002A">
       <w:pPr>
         <w:numPr>
           <w:ilvl w:val="0"/>
@@ -790,7 +790,7 @@
         <w:t xml:space="preserve">IT: especificaciones técnicas incrementales;</w:t>
       </w:r>
     </w:p>
-    <w:p>
+    <w:p ns1:paraId="0000002B">
       <w:pPr>
         <w:numPr>
           <w:ilvl w:val="0"/>
@@ -806,7 +806,7 @@
         <w:t xml:space="preserve">código fuente;</w:t>
       </w:r>
     </w:p>
-    <w:p>
+    <w:p ns1:paraId="0000002C">
       <w:pPr>
         <w:numPr>
           <w:ilvl w:val="0"/>
@@ -822,7 +822,7 @@
         <w:t xml:space="preserve">configuración;</w:t>
       </w:r>
     </w:p>
-    <w:p>
+    <w:p ns1:paraId="0000002D">
       <w:pPr>
         <w:numPr>
           <w:ilvl w:val="0"/>
@@ -838,7 +838,7 @@
         <w:t xml:space="preserve">pruebas;</w:t>
       </w:r>
     </w:p>
-    <w:p>
+    <w:p ns1:paraId="0000002E">
       <w:pPr>
         <w:numPr>
           <w:ilvl w:val="0"/>
@@ -859,13 +859,13 @@
         </w:rPr>
       </w:r>
     </w:p>
-    <w:p>
+    <w:p ns1:paraId="0000002F">
       <w:pPr>
         <w:rPr/>
       </w:pPr>
       <w:r>
         <w:pict>
-          <v:rect style="width:0.0pt;height:1.5pt" o:hr="t" o:hrstd="t" o:hralign="center" fillcolor="#A0A0A0" stroked="f"/>
+          <ns2:rect style="width:0.0pt;height:1.5pt" ns3:hr="t" ns3:hrstd="t" ns3:hralign="center" fillcolor="#A0A0A0" stroked="f"/>
         </w:pict>
       </w:r>
       <w:r>
@@ -874,7 +874,7 @@
         </w:rPr>
       </w:r>
     </w:p>
-    <w:p>
+    <w:p ns1:paraId="00000030">
       <w:pPr>
         <w:pStyle w:val="Heading2"/>
         <w:keepNext w:val="0"/>
@@ -900,7 +900,7 @@
         <w:t xml:space="preserve">5.2 Jerarquía de gobernanza</w:t>
       </w:r>
     </w:p>
-    <w:p>
+    <w:p ns1:paraId="00000031">
       <w:pPr>
         <w:rPr/>
       </w:pPr>
@@ -912,7 +912,7 @@
         <w:t xml:space="preserve">Nivel 1 → DOC-000 (Gobierno del sistema)</w:t>
       </w:r>
     </w:p>
-    <w:p>
+    <w:p ns1:paraId="00000032">
       <w:pPr>
         <w:rPr/>
       </w:pPr>
@@ -924,7 +924,7 @@
         <w:t xml:space="preserve">Nivel 2 → DOC (Arquitectura y diseño)</w:t>
       </w:r>
     </w:p>
-    <w:p>
+    <w:p ns1:paraId="00000033">
       <w:pPr>
         <w:rPr/>
       </w:pPr>
@@ -936,7 +936,7 @@
         <w:t xml:space="preserve">Nivel 3 → ADR (Decisiones técnicas)</w:t>
       </w:r>
     </w:p>
-    <w:p>
+    <w:p ns1:paraId="00000034">
       <w:pPr>
         <w:rPr/>
       </w:pPr>
@@ -948,7 +948,7 @@
         <w:t xml:space="preserve">Nivel 4 → Implementación (Python MVP)</w:t>
       </w:r>
     </w:p>
-    <w:p>
+    <w:p ns1:paraId="00000035">
       <w:pPr>
         <w:rPr/>
       </w:pPr>
@@ -960,13 +960,13 @@
         <w:t xml:space="preserve">Nivel 5 → Evolución y optimización</w:t>
       </w:r>
     </w:p>
-    <w:p>
+    <w:p ns1:paraId="00000036">
       <w:pPr>
         <w:rPr/>
       </w:pPr>
       <w:r>
         <w:pict>
-          <v:rect style="width:0.0pt;height:1.5pt" o:hr="t" o:hrstd="t" o:hralign="center" fillcolor="#A0A0A0" stroked="f"/>
+          <ns2:rect style="width:0.0pt;height:1.5pt" ns3:hr="t" ns3:hrstd="t" ns3:hralign="center" fillcolor="#A0A0A0" stroked="f"/>
         </w:pict>
       </w:r>
       <w:r>
@@ -975,7 +975,7 @@
         </w:rPr>
       </w:r>
     </w:p>
-    <w:p>
+    <w:p ns1:paraId="00000037">
       <w:pPr>
         <w:pStyle w:val="Heading1"/>
         <w:keepNext w:val="0"/>
@@ -1001,7 +1001,7 @@
         <w:t xml:space="preserve">6. Convenciones de identificación</w:t>
       </w:r>
     </w:p>
-    <w:p>
+    <w:p ns1:paraId="00000038">
       <w:pPr>
         <w:pStyle w:val="Heading2"/>
         <w:keepNext w:val="0"/>
@@ -1027,7 +1027,7 @@
         <w:t xml:space="preserve">6.1 Documentos</w:t>
       </w:r>
     </w:p>
-    <w:p>
+    <w:p ns1:paraId="00000039">
       <w:pPr>
         <w:numPr>
           <w:ilvl w:val="0"/>
@@ -1051,7 +1051,7 @@
         <w:t xml:space="preserve">DOC-</w:t>
       </w:r>
     </w:p>
-    <w:p>
+    <w:p ns1:paraId="0000003A">
       <w:pPr>
         <w:numPr>
           <w:ilvl w:val="0"/>
@@ -1075,7 +1075,7 @@
         <w:t xml:space="preserve">DOC-XXX</w:t>
       </w:r>
     </w:p>
-    <w:p>
+    <w:p ns1:paraId="0000003B">
       <w:pPr>
         <w:numPr>
           <w:ilvl w:val="0"/>
@@ -1099,13 +1099,13 @@
         <w:t xml:space="preserve">inmutable una vez asignado</w:t>
       </w:r>
     </w:p>
-    <w:p>
+    <w:p ns1:paraId="0000003C">
       <w:pPr>
         <w:rPr/>
       </w:pPr>
       <w:r>
         <w:pict>
-          <v:rect style="width:0.0pt;height:1.5pt" o:hr="t" o:hrstd="t" o:hralign="center" fillcolor="#A0A0A0" stroked="f"/>
+          <ns2:rect style="width:0.0pt;height:1.5pt" ns3:hr="t" ns3:hrstd="t" ns3:hralign="center" fillcolor="#A0A0A0" stroked="f"/>
         </w:pict>
       </w:r>
       <w:r>
@@ -1114,7 +1114,7 @@
         </w:rPr>
       </w:r>
     </w:p>
-    <w:p>
+    <w:p ns1:paraId="0000003D">
       <w:pPr>
         <w:pStyle w:val="Heading2"/>
         <w:keepNext w:val="0"/>
@@ -1140,7 +1140,7 @@
         <w:t xml:space="preserve">6.2 ADR</w:t>
       </w:r>
     </w:p>
-    <w:p>
+    <w:p ns1:paraId="0000003E">
       <w:pPr>
         <w:numPr>
           <w:ilvl w:val="0"/>
@@ -1164,7 +1164,7 @@
         <w:t xml:space="preserve">ADR-</w:t>
       </w:r>
     </w:p>
-    <w:p>
+    <w:p ns1:paraId="0000003F">
       <w:pPr>
         <w:numPr>
           <w:ilvl w:val="0"/>
@@ -1188,7 +1188,7 @@
         <w:t xml:space="preserve">ADR-XXX</w:t>
       </w:r>
     </w:p>
-    <w:p>
+    <w:p ns1:paraId="00000040">
       <w:pPr>
         <w:numPr>
           <w:ilvl w:val="0"/>
@@ -1204,13 +1204,13 @@
         <w:t xml:space="preserve">Regla: decisiones independientes de implementación</w:t>
       </w:r>
     </w:p>
-    <w:p>
+    <w:p ns1:paraId="00000041">
       <w:pPr>
         <w:rPr/>
       </w:pPr>
       <w:r>
         <w:pict>
-          <v:rect style="width:0.0pt;height:1.5pt" o:hr="t" o:hrstd="t" o:hralign="center" fillcolor="#A0A0A0" stroked="f"/>
+          <ns2:rect style="width:0.0pt;height:1.5pt" ns3:hr="t" ns3:hrstd="t" ns3:hralign="center" fillcolor="#A0A0A0" stroked="f"/>
         </w:pict>
       </w:r>
       <w:r>
@@ -1219,7 +1219,7 @@
         </w:rPr>
       </w:r>
     </w:p>
-    <w:p>
+    <w:p ns1:paraId="00000042">
       <w:pPr>
         <w:pStyle w:val="Heading2"/>
         <w:spacing w:after="240" w:before="240" w:lineRule="auto"/>
@@ -1234,7 +1234,7 @@
         <w:t xml:space="preserve">6.3 Especificaciones técnicas</w:t>
       </w:r>
     </w:p>
-    <w:p>
+    <w:p ns1:paraId="00000043">
       <w:pPr>
         <w:spacing w:after="240" w:before="240" w:lineRule="auto"/>
         <w:ind w:left="0" w:firstLine="0"/>
@@ -1247,7 +1247,7 @@
         <w:t xml:space="preserve">Prefijo ordinario:</w:t>
       </w:r>
     </w:p>
-    <w:p>
+    <w:p ns1:paraId="00000044">
       <w:pPr>
         <w:numPr>
           <w:ilvl w:val="0"/>
@@ -1263,7 +1263,7 @@
         <w:t xml:space="preserve">IT-XXX-YYY</w:t>
       </w:r>
     </w:p>
-    <w:p>
+    <w:p ns1:paraId="00000045">
       <w:pPr>
         <w:spacing w:after="240" w:before="240" w:lineRule="auto"/>
         <w:ind w:left="0" w:firstLine="0"/>
@@ -1276,7 +1276,7 @@
         <w:t xml:space="preserve">Donde:</w:t>
       </w:r>
     </w:p>
-    <w:p>
+    <w:p ns1:paraId="00000046">
       <w:pPr>
         <w:numPr>
           <w:ilvl w:val="0"/>
@@ -1292,7 +1292,7 @@
         <w:t xml:space="preserve">XXX identifica la Capability propietaria;</w:t>
       </w:r>
     </w:p>
-    <w:p>
+    <w:p ns1:paraId="00000047">
       <w:pPr>
         <w:numPr>
           <w:ilvl w:val="0"/>
@@ -1308,7 +1308,7 @@
         <w:t xml:space="preserve">YYY identifica el incremento secuencial dentro de dicha Capability.</w:t>
       </w:r>
     </w:p>
-    <w:p>
+    <w:p ns1:paraId="00000048">
       <w:pPr>
         <w:numPr>
           <w:ilvl w:val="0"/>
@@ -1323,7 +1323,7 @@
         </w:rPr>
       </w:r>
     </w:p>
-    <w:p>
+    <w:p ns1:paraId="00000049">
       <w:pPr>
         <w:spacing w:after="240" w:before="240" w:lineRule="auto"/>
         <w:ind w:left="0" w:firstLine="0"/>
@@ -1336,7 +1336,7 @@
         <w:t xml:space="preserve">Formato transversal excepcional:</w:t>
       </w:r>
     </w:p>
-    <w:p>
+    <w:p ns1:paraId="0000004A">
       <w:pPr>
         <w:numPr>
           <w:ilvl w:val="0"/>
@@ -1352,7 +1352,7 @@
         <w:t xml:space="preserve">IT-REF-YYY</w:t>
       </w:r>
     </w:p>
-    <w:p>
+    <w:p ns1:paraId="0000004B">
       <w:pPr>
         <w:spacing w:after="240" w:before="240" w:lineRule="auto"/>
         <w:ind w:left="0" w:firstLine="0"/>
@@ -1364,7 +1364,7 @@
         </w:rPr>
       </w:r>
     </w:p>
-    <w:p>
+    <w:p ns1:paraId="0000004C">
       <w:pPr>
         <w:spacing w:after="240" w:before="240" w:lineRule="auto"/>
         <w:ind w:left="0" w:firstLine="0"/>
@@ -1377,7 +1377,7 @@
         <w:t xml:space="preserve">El formato IT-REF-YYY se reserva exclusivamente para incrementos técnicos de contratos de referencia transversales autorizados previamente mediante ADR.</w:t>
       </w:r>
     </w:p>
-    <w:p>
+    <w:p ns1:paraId="0000004D">
       <w:pPr>
         <w:spacing w:after="240" w:before="240" w:lineRule="auto"/>
         <w:ind w:left="0" w:firstLine="0"/>
@@ -1390,7 +1390,7 @@
         <w:t xml:space="preserve">Su existencia no crea una Capability REF ni establece una autorización general para nuevos dominios compartidos.</w:t>
       </w:r>
     </w:p>
-    <w:p>
+    <w:p ns1:paraId="0000004E">
       <w:pPr>
         <w:spacing w:after="240" w:before="240" w:lineRule="auto"/>
         <w:ind w:left="0" w:firstLine="0"/>
@@ -1403,7 +1403,7 @@
         <w:t xml:space="preserve">Primer identificador autorizado:</w:t>
       </w:r>
     </w:p>
-    <w:p>
+    <w:p ns1:paraId="0000004F">
       <w:pPr>
         <w:numPr>
           <w:ilvl w:val="0"/>
@@ -1419,13 +1419,13 @@
         <w:t xml:space="preserve">IT-REF-001 — Reference Identity Domain Contracts MVP.</w:t>
       </w:r>
     </w:p>
-    <w:p>
+    <w:p ns1:paraId="00000050">
       <w:pPr>
         <w:rPr/>
       </w:pPr>
       <w:r>
         <w:pict>
-          <v:rect style="width:0.0pt;height:1.5pt" o:hr="t" o:hrstd="t" o:hralign="center" fillcolor="#A0A0A0" stroked="f"/>
+          <ns2:rect style="width:0.0pt;height:1.5pt" ns3:hr="t" ns3:hrstd="t" ns3:hralign="center" fillcolor="#A0A0A0" stroked="f"/>
         </w:pict>
       </w:r>
       <w:r>
@@ -1434,7 +1434,7 @@
         </w:rPr>
       </w:r>
     </w:p>
-    <w:p>
+    <w:p ns1:paraId="00000051">
       <w:pPr>
         <w:pStyle w:val="Heading1"/>
         <w:keepNext w:val="0"/>
@@ -1460,7 +1460,7 @@
         <w:t xml:space="preserve">7. Ciclo de vida de documentos</w:t>
       </w:r>
     </w:p>
-    <w:p>
+    <w:p ns1:paraId="00000052">
       <w:pPr>
         <w:pStyle w:val="Heading2"/>
         <w:keepNext w:val="0"/>
@@ -1486,7 +1486,7 @@
         <w:t xml:space="preserve">Estados permitidos</w:t>
       </w:r>
     </w:p>
-    <w:p>
+    <w:p ns1:paraId="00000053">
       <w:pPr>
         <w:numPr>
           <w:ilvl w:val="0"/>
@@ -1502,7 +1502,7 @@
         <w:t xml:space="preserve">Draft</w:t>
       </w:r>
     </w:p>
-    <w:p>
+    <w:p ns1:paraId="00000054">
       <w:pPr>
         <w:numPr>
           <w:ilvl w:val="0"/>
@@ -1518,7 +1518,7 @@
         <w:t xml:space="preserve">Review</w:t>
       </w:r>
     </w:p>
-    <w:p>
+    <w:p ns1:paraId="00000055">
       <w:pPr>
         <w:numPr>
           <w:ilvl w:val="0"/>
@@ -1534,7 +1534,7 @@
         <w:t xml:space="preserve">Approved</w:t>
       </w:r>
     </w:p>
-    <w:p>
+    <w:p ns1:paraId="00000056">
       <w:pPr>
         <w:numPr>
           <w:ilvl w:val="0"/>
@@ -1550,7 +1550,7 @@
         <w:t xml:space="preserve">Deprecated</w:t>
       </w:r>
     </w:p>
-    <w:p>
+    <w:p ns1:paraId="00000057">
       <w:pPr>
         <w:numPr>
           <w:ilvl w:val="0"/>
@@ -1566,13 +1566,13 @@
         <w:t xml:space="preserve">Archived</w:t>
       </w:r>
     </w:p>
-    <w:p>
+    <w:p ns1:paraId="00000058">
       <w:pPr>
         <w:rPr/>
       </w:pPr>
       <w:r>
         <w:pict>
-          <v:rect style="width:0.0pt;height:1.5pt" o:hr="t" o:hrstd="t" o:hralign="center" fillcolor="#A0A0A0" stroked="f"/>
+          <ns2:rect style="width:0.0pt;height:1.5pt" ns3:hr="t" ns3:hrstd="t" ns3:hralign="center" fillcolor="#A0A0A0" stroked="f"/>
         </w:pict>
       </w:r>
       <w:r>
@@ -1581,7 +1581,7 @@
         </w:rPr>
       </w:r>
     </w:p>
-    <w:p>
+    <w:p ns1:paraId="00000059">
       <w:pPr>
         <w:pStyle w:val="Heading2"/>
         <w:keepNext w:val="0"/>
@@ -1607,7 +1607,7 @@
         <w:t xml:space="preserve">Reglas</w:t>
       </w:r>
     </w:p>
-    <w:p>
+    <w:p ns1:paraId="0000005A">
       <w:pPr>
         <w:numPr>
           <w:ilvl w:val="0"/>
@@ -1623,7 +1623,7 @@
         <w:t xml:space="preserve">Solo documentos Approved pueden guiar implementación</w:t>
       </w:r>
     </w:p>
-    <w:p>
+    <w:p ns1:paraId="0000005B">
       <w:pPr>
         <w:numPr>
           <w:ilvl w:val="0"/>
@@ -1639,7 +1639,7 @@
         <w:t xml:space="preserve">Draft puede cambiar libremente</w:t>
       </w:r>
     </w:p>
-    <w:p>
+    <w:p ns1:paraId="0000005C">
       <w:pPr>
         <w:numPr>
           <w:ilvl w:val="0"/>
@@ -1655,13 +1655,13 @@
         <w:t xml:space="preserve">Deprecated debe mantenerse por trazabilidad</w:t>
       </w:r>
     </w:p>
-    <w:p>
+    <w:p ns1:paraId="0000005D">
       <w:pPr>
         <w:rPr/>
       </w:pPr>
       <w:r>
         <w:pict>
-          <v:rect style="width:0.0pt;height:1.5pt" o:hr="t" o:hrstd="t" o:hralign="center" fillcolor="#A0A0A0" stroked="f"/>
+          <ns2:rect style="width:0.0pt;height:1.5pt" ns3:hr="t" ns3:hrstd="t" ns3:hralign="center" fillcolor="#A0A0A0" stroked="f"/>
         </w:pict>
       </w:r>
       <w:r>
@@ -1670,7 +1670,7 @@
         </w:rPr>
       </w:r>
     </w:p>
-    <w:p>
+    <w:p ns1:paraId="0000005E">
       <w:pPr>
         <w:pStyle w:val="Heading1"/>
         <w:keepNext w:val="0"/>
@@ -1696,7 +1696,7 @@
         <w:t xml:space="preserve">8. Registro de decisiones pendientes (estratégicas)</w:t>
       </w:r>
     </w:p>
-    <w:p>
+    <w:p ns1:paraId="0000005F">
       <w:pPr>
         <w:spacing w:after="240" w:before="240" w:lineRule="auto"/>
         <w:rPr/>
@@ -1708,7 +1708,7 @@
         <w:t xml:space="preserve">Se reconocen como válidas pero no activas:</w:t>
       </w:r>
     </w:p>
-    <w:p>
+    <w:p ns1:paraId="00000060">
       <w:pPr>
         <w:numPr>
           <w:ilvl w:val="0"/>
@@ -1724,7 +1724,7 @@
         <w:t xml:space="preserve">migración a proveedor de datos profesional</w:t>
       </w:r>
     </w:p>
-    <w:p>
+    <w:p ns1:paraId="00000061">
       <w:pPr>
         <w:numPr>
           <w:ilvl w:val="0"/>
@@ -1740,7 +1740,7 @@
         <w:t xml:space="preserve">motor event-driven backtesting</w:t>
       </w:r>
     </w:p>
-    <w:p>
+    <w:p ns1:paraId="00000062">
       <w:pPr>
         <w:numPr>
           <w:ilvl w:val="0"/>
@@ -1756,7 +1756,7 @@
         <w:t xml:space="preserve">base de datos persistente</w:t>
       </w:r>
     </w:p>
-    <w:p>
+    <w:p ns1:paraId="00000063">
       <w:pPr>
         <w:numPr>
           <w:ilvl w:val="0"/>
@@ -1772,7 +1772,7 @@
         <w:t xml:space="preserve">cloud deployment</w:t>
       </w:r>
     </w:p>
-    <w:p>
+    <w:p ns1:paraId="00000064">
       <w:pPr>
         <w:numPr>
           <w:ilvl w:val="0"/>
@@ -1788,13 +1788,13 @@
         <w:t xml:space="preserve">IA para optimización de estrategias</w:t>
       </w:r>
     </w:p>
-    <w:p>
+    <w:p ns1:paraId="00000065">
       <w:pPr>
         <w:rPr/>
       </w:pPr>
       <w:r>
         <w:pict>
-          <v:rect style="width:0.0pt;height:1.5pt" o:hr="t" o:hrstd="t" o:hralign="center" fillcolor="#A0A0A0" stroked="f"/>
+          <ns2:rect style="width:0.0pt;height:1.5pt" ns3:hr="t" ns3:hrstd="t" ns3:hralign="center" fillcolor="#A0A0A0" stroked="f"/>
         </w:pict>
       </w:r>
       <w:r>
@@ -1803,7 +1803,7 @@
         </w:rPr>
       </w:r>
     </w:p>
-    <w:p>
+    <w:p ns1:paraId="00000066">
       <w:pPr>
         <w:pStyle w:val="Heading1"/>
         <w:keepNext w:val="0"/>
@@ -1829,7 +1829,7 @@
         <w:t xml:space="preserve">9. Reglas de consistencia documental</w:t>
       </w:r>
     </w:p>
-    <w:p>
+    <w:p ns1:paraId="00000067">
       <w:pPr>
         <w:spacing w:after="240" w:before="240" w:lineRule="auto"/>
         <w:rPr/>
@@ -1841,7 +1841,7 @@
         <w:t xml:space="preserve">Antes de crear o modificar cualquier documento:</w:t>
       </w:r>
     </w:p>
-    <w:p>
+    <w:p ns1:paraId="00000068">
       <w:pPr>
         <w:numPr>
           <w:ilvl w:val="0"/>
@@ -1857,7 +1857,7 @@
         <w:t xml:space="preserve">Verificar coherencia con DOC-000</w:t>
       </w:r>
     </w:p>
-    <w:p>
+    <w:p ns1:paraId="00000069">
       <w:pPr>
         <w:numPr>
           <w:ilvl w:val="0"/>
@@ -1873,7 +1873,7 @@
         <w:t xml:space="preserve">Verificar numeración existente</w:t>
       </w:r>
     </w:p>
-    <w:p>
+    <w:p ns1:paraId="0000006A">
       <w:pPr>
         <w:numPr>
           <w:ilvl w:val="0"/>
@@ -1889,7 +1889,7 @@
         <w:t xml:space="preserve">Verificar dependencias</w:t>
       </w:r>
     </w:p>
-    <w:p>
+    <w:p ns1:paraId="0000006B">
       <w:pPr>
         <w:numPr>
           <w:ilvl w:val="0"/>
@@ -1905,7 +1905,7 @@
         <w:t xml:space="preserve">Evitar duplicidad conceptual</w:t>
       </w:r>
     </w:p>
-    <w:p>
+    <w:p ns1:paraId="0000006C">
       <w:pPr>
         <w:numPr>
           <w:ilvl w:val="0"/>
@@ -1921,13 +1921,13 @@
         <w:t xml:space="preserve">Validar posición en la secuencia lógica</w:t>
       </w:r>
     </w:p>
-    <w:p>
+    <w:p ns1:paraId="0000006D">
       <w:pPr>
         <w:rPr/>
       </w:pPr>
       <w:r>
         <w:pict>
-          <v:rect style="width:0.0pt;height:1.5pt" o:hr="t" o:hrstd="t" o:hralign="center" fillcolor="#A0A0A0" stroked="f"/>
+          <ns2:rect style="width:0.0pt;height:1.5pt" ns3:hr="t" ns3:hrstd="t" ns3:hralign="center" fillcolor="#A0A0A0" stroked="f"/>
         </w:pict>
       </w:r>
       <w:r>
@@ -1936,7 +1936,7 @@
         </w:rPr>
       </w:r>
     </w:p>
-    <w:p>
+    <w:p ns1:paraId="0000006E">
       <w:pPr>
         <w:pStyle w:val="Heading1"/>
         <w:keepNext w:val="0"/>
@@ -1962,7 +1962,7 @@
         <w:t xml:space="preserve">10. Principios de gobierno</w:t>
       </w:r>
     </w:p>
-    <w:p>
+    <w:p ns1:paraId="0000006F">
       <w:pPr>
         <w:pStyle w:val="Heading2"/>
         <w:keepNext w:val="0"/>
@@ -1988,7 +1988,7 @@
         <w:t xml:space="preserve">10.1 Fuente única de verdad</w:t>
       </w:r>
     </w:p>
-    <w:p>
+    <w:p ns1:paraId="00000070">
       <w:pPr>
         <w:spacing w:after="240" w:before="240" w:lineRule="auto"/>
         <w:rPr/>
@@ -2000,13 +2000,13 @@
         <w:t xml:space="preserve">Todo el conocimiento del sistema debe poder reconstruirse desde esta estructura.</w:t>
       </w:r>
     </w:p>
-    <w:p>
+    <w:p ns1:paraId="00000071">
       <w:pPr>
         <w:rPr/>
       </w:pPr>
       <w:r>
         <w:pict>
-          <v:rect style="width:0.0pt;height:1.5pt" o:hr="t" o:hrstd="t" o:hralign="center" fillcolor="#A0A0A0" stroked="f"/>
+          <ns2:rect style="width:0.0pt;height:1.5pt" ns3:hr="t" ns3:hrstd="t" ns3:hralign="center" fillcolor="#A0A0A0" stroked="f"/>
         </w:pict>
       </w:r>
       <w:r>
@@ -2015,7 +2015,7 @@
         </w:rPr>
       </w:r>
     </w:p>
-    <w:p>
+    <w:p ns1:paraId="00000072">
       <w:pPr>
         <w:pStyle w:val="Heading2"/>
         <w:keepNext w:val="0"/>
@@ -2041,7 +2041,7 @@
         <w:t xml:space="preserve">10.2 Evolución controlada</w:t>
       </w:r>
     </w:p>
-    <w:p>
+    <w:p ns1:paraId="00000073">
       <w:pPr>
         <w:spacing w:after="240" w:before="240" w:lineRule="auto"/>
         <w:rPr/>
@@ -2053,7 +2053,7 @@
         <w:t xml:space="preserve">La arquitectura evoluciona solo mediante:</w:t>
       </w:r>
     </w:p>
-    <w:p>
+    <w:p ns1:paraId="00000074">
       <w:pPr>
         <w:numPr>
           <w:ilvl w:val="0"/>
@@ -2069,7 +2069,7 @@
         <w:t xml:space="preserve">nuevos documentos</w:t>
       </w:r>
     </w:p>
-    <w:p>
+    <w:p ns1:paraId="00000075">
       <w:pPr>
         <w:numPr>
           <w:ilvl w:val="0"/>
@@ -2085,7 +2085,7 @@
         <w:t xml:space="preserve">nuevos ADR</w:t>
       </w:r>
     </w:p>
-    <w:p>
+    <w:p ns1:paraId="00000076">
       <w:pPr>
         <w:numPr>
           <w:ilvl w:val="0"/>
@@ -2101,13 +2101,13 @@
         <w:t xml:space="preserve">versiones explícitas</w:t>
       </w:r>
     </w:p>
-    <w:p>
+    <w:p ns1:paraId="00000077">
       <w:pPr>
         <w:rPr/>
       </w:pPr>
       <w:r>
         <w:pict>
-          <v:rect style="width:0.0pt;height:1.5pt" o:hr="t" o:hrstd="t" o:hralign="center" fillcolor="#A0A0A0" stroked="f"/>
+          <ns2:rect style="width:0.0pt;height:1.5pt" ns3:hr="t" ns3:hrstd="t" ns3:hralign="center" fillcolor="#A0A0A0" stroked="f"/>
         </w:pict>
       </w:r>
       <w:r>
@@ -2116,7 +2116,7 @@
         </w:rPr>
       </w:r>
     </w:p>
-    <w:p>
+    <w:p ns1:paraId="00000078">
       <w:pPr>
         <w:pStyle w:val="Heading2"/>
         <w:keepNext w:val="0"/>
@@ -2142,7 +2142,7 @@
         <w:t xml:space="preserve">10.3 Trazabilidad total</w:t>
       </w:r>
     </w:p>
-    <w:p>
+    <w:p ns1:paraId="00000079">
       <w:pPr>
         <w:spacing w:after="240" w:before="240" w:lineRule="auto"/>
         <w:rPr/>
@@ -2154,13 +2154,13 @@
         <w:t xml:space="preserve">Toda decisión debe poder explicarse retrospectivamente.</w:t>
       </w:r>
     </w:p>
-    <w:p>
+    <w:p ns1:paraId="0000007A">
       <w:pPr>
         <w:rPr/>
       </w:pPr>
       <w:r>
         <w:pict>
-          <v:rect style="width:0.0pt;height:1.5pt" o:hr="t" o:hrstd="t" o:hralign="center" fillcolor="#A0A0A0" stroked="f"/>
+          <ns2:rect style="width:0.0pt;height:1.5pt" ns3:hr="t" ns3:hrstd="t" ns3:hralign="center" fillcolor="#A0A0A0" stroked="f"/>
         </w:pict>
       </w:r>
       <w:r>
@@ -2169,7 +2169,7 @@
         </w:rPr>
       </w:r>
     </w:p>
-    <w:p>
+    <w:p ns1:paraId="0000007B">
       <w:pPr>
         <w:pStyle w:val="Heading2"/>
         <w:keepNext w:val="0"/>
@@ -2195,7 +2195,7 @@
         <w:t xml:space="preserve">10.4 No pérdida de información</w:t>
       </w:r>
     </w:p>
-    <w:p>
+    <w:p ns1:paraId="0000007C">
       <w:pPr>
         <w:spacing w:after="240" w:before="240" w:lineRule="auto"/>
         <w:rPr/>
@@ -2207,13 +2207,13 @@
         <w:t xml:space="preserve">Nada se elimina del sistema documental, solo cambia de estado.</w:t>
       </w:r>
     </w:p>
-    <w:p>
+    <w:p ns1:paraId="0000007D">
       <w:pPr>
         <w:rPr/>
       </w:pPr>
       <w:r>
         <w:pict>
-          <v:rect style="width:0.0pt;height:1.5pt" o:hr="t" o:hrstd="t" o:hralign="center" fillcolor="#A0A0A0" stroked="f"/>
+          <ns2:rect style="width:0.0pt;height:1.5pt" ns3:hr="t" ns3:hrstd="t" ns3:hralign="center" fillcolor="#A0A0A0" stroked="f"/>
         </w:pict>
       </w:r>
       <w:r>
@@ -2222,7 +2222,7 @@
         </w:rPr>
       </w:r>
     </w:p>
-    <w:p>
+    <w:p ns1:paraId="0000007E">
       <w:pPr>
         <w:pStyle w:val="Heading1"/>
         <w:keepNext w:val="0"/>
@@ -2248,7 +2248,7 @@
         <w:t xml:space="preserve">11. Reorganización previa a Baseline 1.0</w:t>
       </w:r>
     </w:p>
-    <w:p>
+    <w:p ns1:paraId="0000007F">
       <w:pPr>
         <w:spacing w:after="240" w:before="240" w:lineRule="auto"/>
         <w:rPr/>
@@ -2260,7 +2260,7 @@
         <w:t xml:space="preserve">Se establece formalmente que:</w:t>
       </w:r>
     </w:p>
-    <w:p>
+    <w:p ns1:paraId="00000080">
       <w:pPr>
         <w:numPr>
           <w:ilvl w:val="0"/>
@@ -2277,7 +2277,7 @@
         <w:t xml:space="preserve">DOC-014 → Estándares de Desarrollo de Software</w:t>
       </w:r>
     </w:p>
-    <w:p>
+    <w:p ns1:paraId="00000081">
       <w:pPr>
         <w:numPr>
           <w:ilvl w:val="0"/>
@@ -2294,7 +2294,7 @@
         <w:t xml:space="preserve">DOC-015 → Implementación del Data Loader (MVP v0.1)</w:t>
       </w:r>
     </w:p>
-    <w:p>
+    <w:p ns1:paraId="00000082">
       <w:pPr>
         <w:numPr>
           <w:ilvl w:val="0"/>
@@ -2311,7 +2311,7 @@
         <w:t xml:space="preserve">DOC-016 → Data Cleaner (planificado)</w:t>
       </w:r>
     </w:p>
-    <w:p>
+    <w:p ns1:paraId="00000083">
       <w:pPr>
         <w:spacing w:after="240" w:before="240" w:lineRule="auto"/>
         <w:rPr/>
@@ -2323,7 +2323,7 @@
         <w:t xml:space="preserve">Esta reorganización se considera:</w:t>
       </w:r>
     </w:p>
-    <w:p>
+    <w:p ns1:paraId="00000084">
       <w:pPr>
         <w:spacing w:after="240" w:before="240" w:lineRule="auto"/>
         <w:ind w:left="600" w:right="600" w:firstLine="0"/>
@@ -2341,13 +2341,13 @@
         <w:t xml:space="preserve">corrección estructural previa al congelamiento de Baseline 1.0</w:t>
       </w:r>
     </w:p>
-    <w:p>
+    <w:p ns1:paraId="00000085">
       <w:pPr>
         <w:rPr/>
       </w:pPr>
       <w:r>
         <w:pict>
-          <v:rect style="width:0.0pt;height:1.5pt" o:hr="t" o:hrstd="t" o:hralign="center" fillcolor="#A0A0A0" stroked="f"/>
+          <ns2:rect style="width:0.0pt;height:1.5pt" ns3:hr="t" ns3:hrstd="t" ns3:hralign="center" fillcolor="#A0A0A0" stroked="f"/>
         </w:pict>
       </w:r>
       <w:r>
@@ -2356,7 +2356,7 @@
         </w:rPr>
       </w:r>
     </w:p>
-    <w:p>
+    <w:p ns1:paraId="00000086">
       <w:pPr>
         <w:pStyle w:val="Heading1"/>
         <w:keepNext w:val="0"/>
@@ -2382,7 +2382,7 @@
         <w:t xml:space="preserve">12. Observación del sistema</w:t>
       </w:r>
     </w:p>
-    <w:p>
+    <w:p ns1:paraId="00000087">
       <w:pPr>
         <w:spacing w:after="240" w:before="240" w:lineRule="auto"/>
         <w:rPr/>
@@ -2394,7 +2394,7 @@
         <w:t xml:space="preserve">Este documento marca un punto crítico:</w:t>
       </w:r>
     </w:p>
-    <w:p>
+    <w:p ns1:paraId="00000088">
       <w:pPr>
         <w:spacing w:after="240" w:before="240" w:lineRule="auto"/>
         <w:ind w:left="600" w:right="600" w:firstLine="0"/>
@@ -2407,13 +2407,13 @@
         <w:t xml:space="preserve">El proyecto deja de ser una colección de decisiones y pasa a ser un sistema gobernado.</w:t>
       </w:r>
     </w:p>
-    <w:p>
+    <w:p ns1:paraId="00000089">
       <w:pPr>
         <w:rPr/>
       </w:pPr>
       <w:r>
         <w:pict>
-          <v:rect style="width:0.0pt;height:1.5pt" o:hr="t" o:hrstd="t" o:hralign="center" fillcolor="#A0A0A0" stroked="f"/>
+          <ns2:rect style="width:0.0pt;height:1.5pt" ns3:hr="t" ns3:hrstd="t" ns3:hralign="center" fillcolor="#A0A0A0" stroked="f"/>
         </w:pict>
       </w:r>
       <w:r>
@@ -2422,7 +2422,7 @@
         </w:rPr>
       </w:r>
     </w:p>
-    <w:p>
+    <w:p ns1:paraId="0000008A">
       <w:pPr>
         <w:pStyle w:val="Heading1"/>
         <w:keepNext w:val="0"/>
@@ -2448,7 +2448,7 @@
         <w:t xml:space="preserve">13. Estado actual del sistema</w:t>
       </w:r>
     </w:p>
-    <w:p>
+    <w:p ns1:paraId="0000008B">
       <w:pPr>
         <w:pStyle w:val="Heading2"/>
         <w:keepNext w:val="0"/>
@@ -2474,90 +2474,214 @@
         <w:t xml:space="preserve">Listo para transición a implementación controlada</w:t>
       </w:r>
     </w:p>
+    <w:p ns1:paraId="0000008C">
+      <w:pPr>
+        <w:spacing w:after="240" w:before="240" w:lineRule="auto"/>
+        <w:rPr/>
+      </w:pPr>
+      <w:r>
+        <w:rPr>
+          <w:rtl w:val="0"/>
+        </w:rPr>
+        <w:t xml:space="preserve">Siguientes pasos:</w:t>
+      </w:r>
+    </w:p>
+    <w:p ns1:paraId="0000008D">
+      <w:pPr>
+        <w:numPr>
+          <w:ilvl w:val="0"/>
+          <w:numId w:val="14"/>
+        </w:numPr>
+        <w:spacing w:after="0" w:afterAutospacing="0" w:before="240" w:lineRule="auto"/>
+        <w:ind w:left="720" w:hanging="360"/>
+      </w:pPr>
+      <w:r>
+        <w:rPr>
+          <w:rtl w:val="0"/>
+        </w:rPr>
+        <w:t xml:space="preserve">DOC-014 (Estándares de Desarrollo de Software)</w:t>
+      </w:r>
+    </w:p>
+    <w:p ns1:paraId="0000008E">
+      <w:pPr>
+        <w:numPr>
+          <w:ilvl w:val="0"/>
+          <w:numId w:val="14"/>
+        </w:numPr>
+        <w:spacing w:after="0" w:afterAutospacing="0" w:before="0" w:beforeAutospacing="0" w:lineRule="auto"/>
+        <w:ind w:left="720" w:hanging="360"/>
+      </w:pPr>
+      <w:r>
+        <w:rPr>
+          <w:rtl w:val="0"/>
+        </w:rPr>
+        <w:t xml:space="preserve">Aplicación de estándares al código existente y futuro</w:t>
+      </w:r>
+    </w:p>
+    <w:p ns1:paraId="0000008F">
+      <w:pPr>
+        <w:numPr>
+          <w:ilvl w:val="0"/>
+          <w:numId w:val="14"/>
+        </w:numPr>
+        <w:spacing w:after="0" w:afterAutospacing="0" w:before="0" w:beforeAutospacing="0" w:lineRule="auto"/>
+        <w:ind w:left="720" w:hanging="360"/>
+      </w:pPr>
+      <w:r>
+        <w:rPr>
+          <w:rtl w:val="0"/>
+        </w:rPr>
+        <w:t xml:space="preserve">Reanudación del desarrollo del MVP</w:t>
+      </w:r>
+    </w:p>
+    <w:p ns1:paraId="00000090">
+      <w:pPr>
+        <w:numPr>
+          <w:ilvl w:val="0"/>
+          <w:numId w:val="14"/>
+        </w:numPr>
+        <w:spacing w:after="240" w:before="0" w:beforeAutospacing="0" w:lineRule="auto"/>
+        <w:ind w:left="720" w:hanging="360"/>
+      </w:pPr>
+      <w:r>
+        <w:rPr>
+          <w:rtl w:val="0"/>
+        </w:rPr>
+        <w:t xml:space="preserve">Validación progresiva del sistema</w:t>
+      </w:r>
+    </w:p>
+    <w:p ns1:paraId="00000091">
+      <w:pPr>
+        <w:rPr/>
+      </w:pPr>
+      <w:r>
+        <w:rPr>
+          <w:rtl w:val="0"/>
+        </w:rPr>
+      </w:r>
+    </w:p>
     <w:p>
       <w:pPr>
-        <w:spacing w:after="240" w:before="240" w:lineRule="auto"/>
-        <w:rPr/>
-      </w:pPr>
-      <w:r>
-        <w:rPr>
-          <w:rtl w:val="0"/>
-        </w:rPr>
-        <w:t xml:space="preserve">Siguientes pasos:</w:t>
+        <w:pStyle w:val="Heading1"/>
+      </w:pPr>
+      <w:r>
+        <w:t xml:space="preserve">14. Navegación arquitectónica de la cadena operacional</w:t>
       </w:r>
     </w:p>
     <w:p>
-      <w:pPr>
-        <w:numPr>
-          <w:ilvl w:val="0"/>
-          <w:numId w:val="14"/>
-        </w:numPr>
-        <w:spacing w:after="0" w:afterAutospacing="0" w:before="240" w:lineRule="auto"/>
-        <w:ind w:left="720" w:hanging="360"/>
-      </w:pPr>
-      <w:r>
-        <w:rPr>
-          <w:rtl w:val="0"/>
-        </w:rPr>
-        <w:t xml:space="preserve">DOC-014 (Estándares de Desarrollo de Software)</w:t>
+      <w:r>
+        <w:t xml:space="preserve">La agrupación Área / Cadena Operacional es una categoría de navegación arquitectónica. No constituye una Capability, no posee contratos públicos y no modifica el ownership ni las fronteras de las Capabilities que relaciona. Continuidad de flujo no equivale a ownership contractual.</w:t>
       </w:r>
     </w:p>
     <w:p>
       <w:pPr>
-        <w:numPr>
-          <w:ilvl w:val="0"/>
-          <w:numId w:val="14"/>
-        </w:numPr>
-        <w:spacing w:after="0" w:afterAutospacing="0" w:before="0" w:beforeAutospacing="0" w:lineRule="auto"/>
-        <w:ind w:left="720" w:hanging="360"/>
-      </w:pPr>
-      <w:r>
-        <w:rPr>
-          <w:rtl w:val="0"/>
-        </w:rPr>
-        <w:t xml:space="preserve">Aplicación de estándares al código existente y futuro</w:t>
+        <w:pStyle w:val="Heading2"/>
+      </w:pPr>
+      <w:r>
+        <w:t xml:space="preserve">14.1 Capabilities vigentes relacionadas</w:t>
       </w:r>
     </w:p>
     <w:p>
-      <w:pPr>
-        <w:numPr>
-          <w:ilvl w:val="0"/>
-          <w:numId w:val="14"/>
-        </w:numPr>
-        <w:spacing w:after="0" w:afterAutospacing="0" w:before="0" w:beforeAutospacing="0" w:lineRule="auto"/>
-        <w:ind w:left="720" w:hanging="360"/>
-      </w:pPr>
-      <w:r>
-        <w:rPr>
-          <w:rtl w:val="0"/>
-        </w:rPr>
-        <w:t xml:space="preserve">Reanudación del desarrollo del MVP</w:t>
+      <w:r>
+        <w:t xml:space="preserve">Área / Cadena Operacional</w:t>
       </w:r>
     </w:p>
     <w:p>
-      <w:pPr>
-        <w:numPr>
-          <w:ilvl w:val="0"/>
-          <w:numId w:val="14"/>
-        </w:numPr>
-        <w:spacing w:after="240" w:before="0" w:beforeAutospacing="0" w:lineRule="auto"/>
-        <w:ind w:left="720" w:hanging="360"/>
-      </w:pPr>
-      <w:r>
-        <w:rPr>
-          <w:rtl w:val="0"/>
-        </w:rPr>
-        <w:t xml:space="preserve">Validación progresiva del sistema</w:t>
+      <w:r>
+        <w:t xml:space="preserve">DOC-034 — Execution</w:t>
       </w:r>
     </w:p>
     <w:p>
-      <w:pPr>
-        <w:rPr/>
-      </w:pPr>
-      <w:r>
-        <w:rPr>
-          <w:rtl w:val="0"/>
-        </w:rPr>
+      <w:r>
+        <w:t xml:space="preserve">DOC-035 — Operational Request</w:t>
+      </w:r>
+    </w:p>
+    <w:p>
+      <w:r>
+        <w:t xml:space="preserve">DOC-036 — Operational Submission</w:t>
+      </w:r>
+    </w:p>
+    <w:p>
+      <w:r>
+        <w:t xml:space="preserve">DOC-037 — Operational Admission</w:t>
+      </w:r>
+    </w:p>
+    <w:p>
+      <w:r>
+        <w:t xml:space="preserve">DOC-038 — Operational Materialization</w:t>
+      </w:r>
+    </w:p>
+    <w:p>
+      <w:r>
+        <w:t xml:space="preserve">Cada una de estas Capabilities conserva su responsabilidad, activo público, productor, consumidor, invariantes, frontera, ownership, incrementos técnicos e implementación.</w:t>
+      </w:r>
+    </w:p>
+    <w:p>
+      <w:pPr>
+        <w:pStyle w:val="Heading2"/>
+      </w:pPr>
+      <w:r>
+        <w:t xml:space="preserve">14.2 Topología contractual</w:t>
+      </w:r>
+    </w:p>
+    <w:p>
+      <w:r>
+        <w:t xml:space="preserve">PortfolioTransition</w:t>
+      </w:r>
+    </w:p>
+    <w:p>
+      <w:r>
+        <w:t xml:space="preserve">↓ DOC-034 — Execution</w:t>
+      </w:r>
+    </w:p>
+    <w:p>
+      <w:r>
+        <w:t xml:space="preserve">OperationalIntent</w:t>
+      </w:r>
+    </w:p>
+    <w:p>
+      <w:r>
+        <w:t xml:space="preserve">↓ DOC-035 — Operational Request</w:t>
+      </w:r>
+    </w:p>
+    <w:p>
+      <w:r>
+        <w:t xml:space="preserve">OperationalRequest</w:t>
+      </w:r>
+    </w:p>
+    <w:p>
+      <w:r>
+        <w:t xml:space="preserve">↓ DOC-036 — Operational Submission</w:t>
+      </w:r>
+    </w:p>
+    <w:p>
+      <w:r>
+        <w:t xml:space="preserve">OperationalSubmission</w:t>
+      </w:r>
+    </w:p>
+    <w:p>
+      <w:r>
+        <w:t xml:space="preserve">↓ DOC-037 — Operational Admission</w:t>
+      </w:r>
+    </w:p>
+    <w:p>
+      <w:r>
+        <w:t xml:space="preserve">OperationalAdmission</w:t>
+      </w:r>
+    </w:p>
+    <w:p>
+      <w:r>
+        <w:t xml:space="preserve">↓ DOC-038 — Operational Materialization</w:t>
+      </w:r>
+    </w:p>
+    <w:p>
+      <w:r>
+        <w:t xml:space="preserve">OperationalMaterialization</w:t>
+      </w:r>
+    </w:p>
+    <w:p>
+      <w:r>
+        <w:t xml:space="preserve">Esta topología representa la continuidad productor → activo → consumidor. No presenta ninguna Capability como componente interno o propiedad contractual de otra.</w:t>
       </w:r>
     </w:p>
     <w:sectPr>

</xml_diff>

<commit_message>
docs: clarify portfolio capability hierarchy
</commit_message>
<xml_diff>
--- a/docs/DOC-000 — Índice Maestro de Arquitectura y Gobierno Documental.docx
+++ b/docs/DOC-000 — Índice Maestro de Arquitectura y Gobierno Documental.docx
@@ -2682,6 +2682,135 @@
     <w:p>
       <w:r>
         <w:t xml:space="preserve">Esta topología representa la continuidad productor → activo → consumidor. No presenta ninguna Capability como componente interno o propiedad contractual de otra.</w:t>
+      </w:r>
+    </w:p>
+    <w:p>
+      <w:pPr>
+        <w:pStyle w:val="Heading1"/>
+      </w:pPr>
+      <w:r>
+        <w:t xml:space="preserve">15. Navegación arquitectónica del ciclo Portfolio y estado económico</w:t>
+      </w:r>
+    </w:p>
+    <w:p>
+      <w:r>
+        <w:t xml:space="preserve">La agrupación Ciclo Portfolio / Estado Económico es una categoría de navegación arquitectónica. No constituye una Capability, no posee contratos públicos y no modifica el ownership ni las fronteras de las Capabilities relacionadas. Compartir PortfolioState o participar en el mismo ciclo no implica containment ni ownership común.</w:t>
+      </w:r>
+    </w:p>
+    <w:p>
+      <w:pPr>
+        <w:pStyle w:val="Heading2"/>
+      </w:pPr>
+      <w:r>
+        <w:t xml:space="preserve">15.1 Capabilities vigentes relacionadas</w:t>
+      </w:r>
+    </w:p>
+    <w:p>
+      <w:r>
+        <w:t xml:space="preserve">DOC-032 — Portfolio</w:t>
+      </w:r>
+    </w:p>
+    <w:p>
+      <w:r>
+        <w:t xml:space="preserve">DOC-033 — Portfolio Transition</w:t>
+      </w:r>
+    </w:p>
+    <w:p>
+      <w:r>
+        <w:t xml:space="preserve">DOC-040 — Post-Materialization Economic Consequence</w:t>
+      </w:r>
+    </w:p>
+    <w:p>
+      <w:r>
+        <w:t xml:space="preserve">Portfolio determina el estado objetivo. Portfolio Transition publica la transformación pretendida entre el estado actual y el objetivo. Post-Materialization Economic Consequence publica la relación económica realizada entre un estado previo, hechos materiales reconocidos y el estado posterior resultante. Las tres conservan ownership independiente.</w:t>
+      </w:r>
+    </w:p>
+    <w:p>
+      <w:pPr>
+        <w:pStyle w:val="Heading2"/>
+      </w:pPr>
+      <w:r>
+        <w:t xml:space="preserve">15.2 Topología contractual del ciclo</w:t>
+      </w:r>
+    </w:p>
+    <w:p>
+      <w:r>
+        <w:t xml:space="preserve">RiskEvaluationResult + Current PortfolioState</w:t>
+      </w:r>
+    </w:p>
+    <w:p>
+      <w:r>
+        <w:t xml:space="preserve">↓ DOC-032 — Portfolio</w:t>
+      </w:r>
+    </w:p>
+    <w:p>
+      <w:r>
+        <w:t xml:space="preserve">Target PortfolioState</w:t>
+      </w:r>
+    </w:p>
+    <w:p>
+      <w:r>
+        <w:t xml:space="preserve">Current PortfolioState + Target PortfolioState</w:t>
+      </w:r>
+    </w:p>
+    <w:p>
+      <w:r>
+        <w:t xml:space="preserve">↓ DOC-033 — Portfolio Transition</w:t>
+      </w:r>
+    </w:p>
+    <w:p>
+      <w:r>
+        <w:t xml:space="preserve">PortfolioTransition</w:t>
+      </w:r>
+    </w:p>
+    <w:p>
+      <w:r>
+        <w:t xml:space="preserve">↓ DOC-034 — Execution</w:t>
+      </w:r>
+    </w:p>
+    <w:p>
+      <w:r>
+        <w:t xml:space="preserve">OperationalIntent → cadena operacional documentada en la sección 14</w:t>
+      </w:r>
+    </w:p>
+    <w:p>
+      <w:r>
+        <w:t xml:space="preserve">↓ DOC-038 — Operational Materialization</w:t>
+      </w:r>
+    </w:p>
+    <w:p>
+      <w:r>
+        <w:t xml:space="preserve">1..N OperationalMaterialization + Previous PortfolioState</w:t>
+      </w:r>
+    </w:p>
+    <w:p>
+      <w:r>
+        <w:t xml:space="preserve">↓ DOC-040 — Post-Materialization Economic Consequence</w:t>
+      </w:r>
+    </w:p>
+    <w:p>
+      <w:r>
+        <w:t xml:space="preserve">PostMaterializationEconomicConsequence</w:t>
+      </w:r>
+    </w:p>
+    <w:p>
+      <w:r>
+        <w:t xml:space="preserve">↓ contiene y preserva la procedencia del resultado</w:t>
+      </w:r>
+    </w:p>
+    <w:p>
+      <w:r>
+        <w:t xml:space="preserve">Resulting PortfolioState</w:t>
+      </w:r>
+    </w:p>
+    <w:p>
+      <w:r>
+        <w:t xml:space="preserve">↓ puede desempeñar posteriormente el rol de Current PortfolioState</w:t>
+      </w:r>
+    </w:p>
+    <w:p>
+      <w:r>
+        <w:t xml:space="preserve">DOC-034 y DOC-038 aparecen aquí únicamente como fronteras de continuidad con la cadena operacional de la sección 14. Esta topología no reasigna sus ownership ni clasifica DOC-039 o documentos posteriores.</w:t>
       </w:r>
     </w:p>
     <w:sectPr>

</xml_diff>

<commit_message>
docs: deprecate unused materialization interpretation capability
</commit_message>
<xml_diff>
--- a/docs/DOC-000 — Índice Maestro de Arquitectura y Gobierno Documental.docx
+++ b/docs/DOC-000 — Índice Maestro de Arquitectura y Gobierno Documental.docx
@@ -2811,6 +2811,32 @@
     <w:p>
       <w:r>
         <w:t xml:space="preserve">DOC-034 y DOC-038 aparecen aquí únicamente como fronteras de continuidad con la cadena operacional de la sección 14. Esta topología no reasigna sus ownership ni clasifica DOC-039 o documentos posteriores.</w:t>
+      </w:r>
+    </w:p>
+    <w:p>
+      <w:pPr>
+        <w:pStyle w:val="Heading1"/>
+      </w:pPr>
+      <w:r>
+        <w:t>16. Disposición de DOC-039 — Operational Materialization Interpretation</w:t>
+      </w:r>
+    </w:p>
+    <w:p>
+      <w:pPr/>
+      <w:r>
+        <w:t>DOC-039 y su incremento IT-039-001 quedan en estado Deprecated y se mantienen por trazabilidad conforme a la sección 7. El contrato implementado permanece como evidencia técnica válida, pero DOC-039 queda fuera de los mapas y rutas arquitectónicas canónicas vigentes porque no existe un consumidor real demostrado que requiera OperationalMaterializationInterpretation.</w:t>
+      </w:r>
+    </w:p>
+    <w:p>
+      <w:pPr/>
+      <w:r>
+        <w:t>La cadena operacional canónica termina en DOC-038 — Operational Materialization. El ciclo Portfolio / Estado Económico continúa desde uno o más OperationalMaterialization directamente hacia DOC-040 — Post-Materialization Economic Consequence. No deberá inferirse la secuencia DOC-038 → DOC-039 → DOC-040.</w:t>
+      </w:r>
+    </w:p>
+    <w:p>
+      <w:pPr/>
+      <w:r>
+        <w:t>Esta disposición no elimina ni modifica runtime, API pública, pruebas, demo o historia de DOC-039. Tampoco autoriza su extensión. Una necesidad futura deberá ser demostrada nuevamente mediante el proceso arquitectónico vigente antes de reactivar el documento o incorporar su contrato a una ruta canónica.</w:t>
       </w:r>
     </w:p>
     <w:sectPr>

</xml_diff>

<commit_message>
docs: recover economic reality capability hierarchy
</commit_message>
<xml_diff>
--- a/docs/DOC-000 — Índice Maestro de Arquitectura y Gobierno Documental.docx
+++ b/docs/DOC-000 — Índice Maestro de Arquitectura y Gobierno Documental.docx
@@ -2837,6 +2837,44 @@
       <w:pPr/>
       <w:r>
         <w:t>Esta disposición no elimina ni modifica runtime, API pública, pruebas, demo o historia de DOC-039. Tampoco autoriza su extensión. Una necesidad futura deberá ser demostrada nuevamente mediante el proceso arquitectónico vigente antes de reactivar el documento o incorporar su contrato a una ruta canónica.</w:t>
+      </w:r>
+    </w:p>
+    <w:p>
+      <w:pPr>
+        <w:pStyle w:val="Heading1"/>
+      </w:pPr>
+      <w:r>
+        <w:t>17. Navegación arquitectónica del área Economic Reality</w:t>
+      </w:r>
+    </w:p>
+    <w:p>
+      <w:pPr/>
+      <w:r>
+        <w:t>Economic Reality es un área/cadena de navegación arquitectónica. No constituye una Capability, no posee contratos públicos y no transfiere ownership entre las Capabilities relacionadas.</w:t>
+      </w:r>
+    </w:p>
+    <w:p>
+      <w:pPr/>
+      <w:r>
+        <w:t>Capabilities vigentes relacionadas: DOC-041 — External Economic Observation; DOC-042 — Internal Economic Reality Qualification; DOC-043 — Economic Reality Verification; DOC-044 — Post-Verification Qualification. Cada una conserva responsabilidad, autoridad, contratos, invariantes y fronteras independientes.</w:t>
+      </w:r>
+    </w:p>
+    <w:p>
+      <w:pPr/>
+      <w:r>
+        <w:t>La topología contractual canónica es: evidencia económica externa independiente → DOC-041 → ExternallyObservedEconomicReality; PortfolioState más evidencia temporal interna → DOC-042 → InternalEconomicReality; InternalEconomicReality + ExternallyObservedEconomicReality → DOC-043 → EconomicRealityVerification; EconomicRealityVerification + RequiredCorroborationScope → DOC-044 → PostVerificationQualification.</w:t>
+      </w:r>
+    </w:p>
+    <w:p>
+      <w:pPr/>
+      <w:r>
+        <w:t>DOC-045 — Economic Reality Reliance Disposition y su incremento IT-045-001 quedan Deprecated y fuera de la continuidad canónica vigente. Su contrato implementado se preserva como evidencia técnica e histórica, pero no existe un consumidor productivo o contractual downstream demostrado para EconomicRealityRelianceDisposition. No deberá inferirse que DOC-044 → DOC-045 sea un paso obligatorio del flujo vigente.</w:t>
+      </w:r>
+    </w:p>
+    <w:p>
+      <w:pPr/>
+      <w:r>
+        <w:t>La continuidad descrita expresa relaciones productor → activo → consumidor. No implica containment, ownership común ni autorización para Portfolio Target Determination u otra responsabilidad posterior.</w:t>
       </w:r>
     </w:p>
     <w:sectPr>

</xml_diff>